<commit_message>
Add dedicated closing slide (Thanks for Listening to Us) and update presenter names
</commit_message>
<xml_diff>
--- a/presentation/Beyond_the_Logo.docx
+++ b/presentation/Beyond_the_Logo.docx
@@ -20,7 +20,7 @@
         </w:rPr>
         <w:t>Presentation Slides, Content &amp; Speaking Notes</w:t>
         <w:br/>
-        <w:t>Presenters: Kaan &amp; Caner | Planned Duration: 12 Minutes (720 Seconds)</w:t>
+        <w:t>Presenters: Kaan Yazıcıoğlu &amp; Can Akcasu | Designed for 25-Minute Session</w:t>
       </w:r>
     </w:p>
     <w:p>
@@ -142,7 +142,7 @@
           <w:color w:val="1F2937"/>
           <w:sz w:val="22"/>
         </w:rPr>
-        <w:t>Hi, I’m Kaan, and this is Caner. Today we’ll look at how we recognize brands without their names. Sometimes a color, a shape, or a package is enough. In daily life, we rarely read every logo on a shelf. Instead, we spot familiar bottles and colors. We’ll explore four famous examples to see how this works.</w:t>
+        <w:t>Hi, I’m Kaan, and this is Can. Today we’ll look at how we recognize brands without their names. Sometimes a color, a shape, or a package is enough. In daily life, we rarely read every logo on a shelf. Instead, we spot familiar bottles and colors. We’ll explore four famous examples to see how this works.</w:t>
       </w:r>
     </w:p>
     <w:p>
@@ -678,7 +678,7 @@
           <w:color w:val="1F2937"/>
           <w:sz w:val="22"/>
         </w:rPr>
-        <w:t>We often hear that red creates hunger and blue builds trust. But a color does not mean the same thing to everyone. With brands, we learn these links by seeing the same colors again and again. So using a color consistently matters. Caner will show you some examples.</w:t>
+        <w:t>We often hear that red creates hunger and blue builds trust. But a color does not mean the same thing to everyone. With brands, we learn these links by seeing the same colors again and again. So using a color consistently matters. Can will show you some examples.</w:t>
       </w:r>
     </w:p>
     <w:p>
@@ -703,7 +703,7 @@
           <w:color w:val="6B7280"/>
           <w:sz w:val="22"/>
         </w:rPr>
-        <w:t>Speaker: Caner | Planned Timing: 36s</w:t>
+        <w:t>Speaker: Can | Planned Timing: 36s</w:t>
       </w:r>
     </w:p>
     <w:p>
@@ -837,7 +837,7 @@
           <w:color w:val="6B7280"/>
           <w:sz w:val="22"/>
         </w:rPr>
-        <w:t>Speaker: Caner | Planned Timing: 36s</w:t>
+        <w:t>Speaker: Can | Planned Timing: 36s</w:t>
       </w:r>
     </w:p>
     <w:p>
@@ -971,7 +971,7 @@
           <w:color w:val="6B7280"/>
           <w:sz w:val="22"/>
         </w:rPr>
-        <w:t>Speaker: Caner | Planned Timing: 36s</w:t>
+        <w:t>Speaker: Can | Planned Timing: 36s</w:t>
       </w:r>
     </w:p>
     <w:p>
@@ -1105,7 +1105,7 @@
           <w:color w:val="6B7280"/>
           <w:sz w:val="22"/>
         </w:rPr>
-        <w:t>Speaker: Caner | Planned Timing: 36s</w:t>
+        <w:t>Speaker: Can | Planned Timing: 36s</w:t>
       </w:r>
     </w:p>
     <w:p>
@@ -1239,7 +1239,7 @@
           <w:color w:val="6B7280"/>
           <w:sz w:val="22"/>
         </w:rPr>
-        <w:t>Speaker: Caner | Planned Timing: 36s</w:t>
+        <w:t>Speaker: Can | Planned Timing: 36s</w:t>
       </w:r>
     </w:p>
     <w:p>
@@ -1373,7 +1373,7 @@
           <w:color w:val="6B7280"/>
           <w:sz w:val="22"/>
         </w:rPr>
-        <w:t>Speaker: Caner | Planned Timing: 36s</w:t>
+        <w:t>Speaker: Can | Planned Timing: 36s</w:t>
       </w:r>
     </w:p>
     <w:p>
@@ -1507,7 +1507,7 @@
           <w:color w:val="6B7280"/>
           <w:sz w:val="22"/>
         </w:rPr>
-        <w:t>Speaker: Caner | Planned Timing: 36s</w:t>
+        <w:t>Speaker: Can | Planned Timing: 36s</w:t>
       </w:r>
     </w:p>
     <w:p>
@@ -1641,7 +1641,7 @@
           <w:color w:val="6B7280"/>
           <w:sz w:val="22"/>
         </w:rPr>
-        <w:t>Speaker: Caner | Planned Timing: 36s</w:t>
+        <w:t>Speaker: Can | Planned Timing: 36s</w:t>
       </w:r>
     </w:p>
     <w:p>
@@ -1775,7 +1775,7 @@
           <w:color w:val="6B7280"/>
           <w:sz w:val="22"/>
         </w:rPr>
-        <w:t>Speaker: Caner | Planned Timing: 36s</w:t>
+        <w:t>Speaker: Can | Planned Timing: 36s</w:t>
       </w:r>
     </w:p>
     <w:p>
@@ -2018,7 +2018,7 @@
           <w:color w:val="1F2937"/>
           <w:sz w:val="22"/>
         </w:rPr>
-        <w:t>Thanks, Caner. IKEA created another famous clue: the blue FRAKTA bag. In 1986, shoppers got tired carrying heavy goods. IKEA tested yellow bags in 1989, but checkout got confusing. So yellow bags stayed inside for borrowing. Blue bags were sold to take home. That durable bag became a familiar household clue.</w:t>
+        <w:t>Thanks, Can. IKEA created another famous clue: the blue FRAKTA bag. In 1986, shoppers got tired carrying heavy goods. IKEA tested yellow bags in 1989, but checkout got confusing. So yellow bags stayed inside for borrowing. Blue bags were sold to take home. That durable bag became a familiar household clue.</w:t>
       </w:r>
     </w:p>
     <w:p>
@@ -2688,7 +2688,7 @@
           <w:color w:val="1F2937"/>
           <w:sz w:val="22"/>
         </w:rPr>
-        <w:t>To wrap up, logos still matter at the final moment. But in crowded places, shapes and colors catch our attention first. Bottles, fry cartons, and gift boxes guide us without words. Thank you very much for your time. Caner and I are happy to take any questions.</w:t>
+        <w:t>To wrap up, logos still matter at the final moment. But in crowded places, shapes and colors catch our attention first. Bottles, fry cartons, and gift boxes guide us without words. Thank you very much for your time. Can and I are happy to take any questions.</w:t>
       </w:r>
     </w:p>
     <w:p>
@@ -2703,7 +2703,7 @@
           <w:color w:val="111827"/>
           <w:sz w:val="32"/>
         </w:rPr>
-        <w:t>Slide 21: References: Research Studies and Corporate Archives</w:t>
+        <w:t>Slide 21: Thank You for Listening</w:t>
       </w:r>
     </w:p>
     <w:p>
@@ -2763,7 +2763,7 @@
         <w:rPr>
           <w:sz w:val="22"/>
         </w:rPr>
-        <w:t>S1: Romaniuk, J., Sharp, B., &amp; Ehrenberg, A. Evidence concerning the importance of perceived brand differentiation. Australasian Marketing Journal / Ehrenberg-Bass Institute. https://assets.marketingscience.info/different.pdf</w:t>
+        <w:t>Beyond the Logo: Can We Recognize a Brand Without Its Name?</w:t>
       </w:r>
     </w:p>
     <w:p>
@@ -2775,43 +2775,7 @@
         <w:rPr>
           <w:sz w:val="22"/>
         </w:rPr>
-        <w:t>S2: Romaniuk, J. Q&amp;A: Seven Costly Sins of Brand Identity. Ehrenberg-Bass Institute for Marketing Science. https://assets.marketingscience.info/Brand-Identity-QA.pdf</w:t>
-      </w:r>
-    </w:p>
-    <w:p>
-      <w:pPr>
-        <w:pStyle w:val="ListBullet"/>
-        <w:spacing w:after="40"/>
-      </w:pPr>
-      <w:r>
-        <w:rPr>
-          <w:sz w:val="22"/>
-        </w:rPr>
-        <w:t>S3: Romaniuk, J. (2013). Brands of Distinction. UniSA Business Magazine / Ehrenberg-Bass Institute for Marketing Science. https://marketingscience.info/news-and-insights/brands-of-distinction</w:t>
-      </w:r>
-    </w:p>
-    <w:p>
-      <w:pPr>
-        <w:pStyle w:val="ListBullet"/>
-        <w:spacing w:after="40"/>
-      </w:pPr>
-      <w:r>
-        <w:rPr>
-          <w:sz w:val="22"/>
-        </w:rPr>
-        <w:t>S4: The Coca-Cola Company. The History of the Coca-Cola Contour Bottle. The Coca-Cola Company. https://www.coca-colacompany.com/about-us/history/the-history-of-the-coca-cola-contour-bottle</w:t>
-      </w:r>
-    </w:p>
-    <w:p>
-      <w:pPr>
-        <w:pStyle w:val="ListBullet"/>
-        <w:spacing w:after="40"/>
-      </w:pPr>
-      <w:r>
-        <w:rPr>
-          <w:sz w:val="22"/>
-        </w:rPr>
-        <w:t>S5: Tiffany &amp; Co. Tiffany Blue: A Color So Famous, It's Trademarked. Tiffany &amp; Co. https://press.tiffany.com/our-story/tiffany-blue/</w:t>
+        <w:t>Questions &amp; Discussion</w:t>
       </w:r>
     </w:p>
     <w:p>
@@ -2826,7 +2790,7 @@
           <w:color w:val="111827"/>
           <w:sz w:val="32"/>
         </w:rPr>
-        <w:t>Slide 22: References: Museum Archives, News and Agency Records</w:t>
+        <w:t>Slide 22: References: Research Studies and Corporate Archives</w:t>
       </w:r>
     </w:p>
     <w:p>
@@ -2886,7 +2850,7 @@
         <w:rPr>
           <w:sz w:val="22"/>
         </w:rPr>
-        <w:t>S6: IKEA Museum. History of the logotype: The small steps of evolution. IKEA Museum / Inter IKEA Systems B.V. https://ikeamuseum.com/en/explore/the-story-of-ikea/history-of-the-logotype/</w:t>
+        <w:t>S1: Romaniuk, J., Sharp, B., &amp; Ehrenberg, A. Evidence concerning the importance of perceived brand differentiation. Australasian Marketing Journal / Ehrenberg-Bass Institute. https://assets.marketingscience.info/different.pdf</w:t>
       </w:r>
     </w:p>
     <w:p>
@@ -2898,7 +2862,7 @@
         <w:rPr>
           <w:sz w:val="22"/>
         </w:rPr>
-        <w:t>S7: IKEA Museum. Beloved bag: The story of FRAKTA. IKEA Museum / Inter IKEA Systems B.V. https://ikeamuseum.com/en/explore/the-story-of-ikea/beloved-bag/</w:t>
+        <w:t>S2: Romaniuk, J. Q&amp;A: Seven Costly Sins of Brand Identity. Ehrenberg-Bass Institute for Marketing Science. https://assets.marketingscience.info/Brand-Identity-QA.pdf</w:t>
       </w:r>
     </w:p>
     <w:p>
@@ -2910,7 +2874,7 @@
         <w:rPr>
           <w:sz w:val="22"/>
         </w:rPr>
-        <w:t>S8: NBC News / The Associated Press. McDonald’s rolling out green logo in Europe. NBC News. https://www.nbcnews.com/id/wbna34111784</w:t>
+        <w:t>S3: Romaniuk, J. (2013). Brands of Distinction. UniSA Business Magazine / Ehrenberg-Bass Institute for Marketing Science. https://marketingscience.info/news-and-insights/brands-of-distinction</w:t>
       </w:r>
     </w:p>
     <w:p>
@@ -2922,7 +2886,19 @@
         <w:rPr>
           <w:sz w:val="22"/>
         </w:rPr>
-        <w:t>S9: Cossette. Cossette and McDonald's deconstruct the iconic Golden Arches to direct people to the nearest restaurant (Follow the Arches). Cossette. https://www.cossette.com/en/blog/__temp_icoufkdgyfmhfyeayjfwwthtvmmmmbyghnhu</w:t>
+        <w:t>S4: The Coca-Cola Company. The History of the Coca-Cola Contour Bottle. The Coca-Cola Company. https://www.coca-colacompany.com/about-us/history/the-history-of-the-coca-cola-contour-bottle</w:t>
+      </w:r>
+    </w:p>
+    <w:p>
+      <w:pPr>
+        <w:pStyle w:val="ListBullet"/>
+        <w:spacing w:after="40"/>
+      </w:pPr>
+      <w:r>
+        <w:rPr>
+          <w:sz w:val="22"/>
+        </w:rPr>
+        <w:t>S5: Tiffany &amp; Co. Tiffany Blue: A Color So Famous, It's Trademarked. Tiffany &amp; Co. https://press.tiffany.com/our-story/tiffany-blue/</w:t>
       </w:r>
     </w:p>
     <w:p>
@@ -2937,7 +2913,7 @@
           <w:color w:val="111827"/>
           <w:sz w:val="32"/>
         </w:rPr>
-        <w:t>Slide 23: Slide 23</w:t>
+        <w:t>Slide 23: References: Museum Archives, News and Agency Records</w:t>
       </w:r>
     </w:p>
     <w:p>
@@ -2977,6 +2953,66 @@
       </w:r>
     </w:p>
     <w:p>
+      <w:pPr>
+        <w:spacing w:before="160" w:after="40"/>
+      </w:pPr>
+      <w:r>
+        <w:rPr>
+          <w:b/>
+          <w:sz w:val="24"/>
+        </w:rPr>
+        <w:t>Key Slide Points:</w:t>
+      </w:r>
+    </w:p>
+    <w:p>
+      <w:pPr>
+        <w:pStyle w:val="ListBullet"/>
+        <w:spacing w:after="40"/>
+      </w:pPr>
+      <w:r>
+        <w:rPr>
+          <w:sz w:val="22"/>
+        </w:rPr>
+        <w:t>S6: IKEA Museum. History of the logotype: The small steps of evolution. IKEA Museum / Inter IKEA Systems B.V. https://ikeamuseum.com/en/explore/the-story-of-ikea/history-of-the-logotype/</w:t>
+      </w:r>
+    </w:p>
+    <w:p>
+      <w:pPr>
+        <w:pStyle w:val="ListBullet"/>
+        <w:spacing w:after="40"/>
+      </w:pPr>
+      <w:r>
+        <w:rPr>
+          <w:sz w:val="22"/>
+        </w:rPr>
+        <w:t>S7: IKEA Museum. Beloved bag: The story of FRAKTA. IKEA Museum / Inter IKEA Systems B.V. https://ikeamuseum.com/en/explore/the-story-of-ikea/beloved-bag/</w:t>
+      </w:r>
+    </w:p>
+    <w:p>
+      <w:pPr>
+        <w:pStyle w:val="ListBullet"/>
+        <w:spacing w:after="40"/>
+      </w:pPr>
+      <w:r>
+        <w:rPr>
+          <w:sz w:val="22"/>
+        </w:rPr>
+        <w:t>S8: NBC News / The Associated Press. McDonald’s rolling out green logo in Europe. NBC News. https://www.nbcnews.com/id/wbna34111784</w:t>
+      </w:r>
+    </w:p>
+    <w:p>
+      <w:pPr>
+        <w:pStyle w:val="ListBullet"/>
+        <w:spacing w:after="40"/>
+      </w:pPr>
+      <w:r>
+        <w:rPr>
+          <w:sz w:val="22"/>
+        </w:rPr>
+        <w:t>S9: Cossette. Cossette and McDonald's deconstruct the iconic Golden Arches to direct people to the nearest restaurant (Follow the Arches). Cossette. https://www.cossette.com/en/blog/__temp_icoufkdgyfmhfyeayjfwwthtvmmmmbyghnhu</w:t>
+      </w:r>
+    </w:p>
+    <w:p>
       <w:r>
         <w:br w:type="page"/>
       </w:r>
@@ -3009,6 +3045,57 @@
                   </pic:nvPicPr>
                   <pic:blipFill>
                     <a:blip r:embed="rId32"/>
+                    <a:stretch>
+                      <a:fillRect/>
+                    </a:stretch>
+                  </pic:blipFill>
+                  <pic:spPr>
+                    <a:xfrm>
+                      <a:off x="0" y="0"/>
+                      <a:ext cx="5669280" cy="3186757"/>
+                    </a:xfrm>
+                    <a:prstGeom prst="rect"/>
+                  </pic:spPr>
+                </pic:pic>
+              </a:graphicData>
+            </a:graphic>
+          </wp:inline>
+        </w:drawing>
+      </w:r>
+    </w:p>
+    <w:p>
+      <w:r>
+        <w:br w:type="page"/>
+      </w:r>
+    </w:p>
+    <w:p>
+      <w:r>
+        <w:rPr>
+          <w:b/>
+          <w:color w:val="111827"/>
+          <w:sz w:val="32"/>
+        </w:rPr>
+        <w:t>Slide 25: Slide 25</w:t>
+      </w:r>
+    </w:p>
+    <w:p>
+      <w:r>
+        <w:drawing>
+          <wp:inline xmlns:a="http://schemas.openxmlformats.org/drawingml/2006/main" xmlns:pic="http://schemas.openxmlformats.org/drawingml/2006/picture">
+            <wp:extent cx="5669280" cy="3186757"/>
+            <wp:docPr id="25" name="Picture 25"/>
+            <wp:cNvGraphicFramePr>
+              <a:graphicFrameLocks noChangeAspect="1"/>
+            </wp:cNvGraphicFramePr>
+            <a:graphic>
+              <a:graphicData uri="http://schemas.openxmlformats.org/drawingml/2006/picture">
+                <pic:pic>
+                  <pic:nvPicPr>
+                    <pic:cNvPr id="0" name="slide_25.png"/>
+                    <pic:cNvPicPr/>
+                  </pic:nvPicPr>
+                  <pic:blipFill>
+                    <a:blip r:embed="rId33"/>
                     <a:stretch>
                       <a:fillRect/>
                     </a:stretch>

</xml_diff>

<commit_message>
Correct presenter name to Caner Akcasu across slides, scripts, and documentation
</commit_message>
<xml_diff>
--- a/presentation/Beyond_the_Logo.docx
+++ b/presentation/Beyond_the_Logo.docx
@@ -20,7 +20,7 @@
         </w:rPr>
         <w:t>Presentation Slides, Content &amp; Speaking Notes</w:t>
         <w:br/>
-        <w:t>Presenters: Kaan Yazıcıoğlu &amp; Can Akcasu | Designed for 25-Minute Session</w:t>
+        <w:t>Presenters: Kaan Yazıcıoğlu &amp; Caner Akcasu | Designed for 25-Minute Session</w:t>
       </w:r>
     </w:p>
     <w:p>
@@ -142,7 +142,7 @@
           <w:color w:val="1F2937"/>
           <w:sz w:val="22"/>
         </w:rPr>
-        <w:t>Hi, I’m Kaan, and this is Can. Today we’ll look at how we recognize brands without their names. Sometimes a color, a shape, or a package is enough. In daily life, we rarely read every logo on a shelf. Instead, we spot familiar bottles and colors. We’ll explore four famous examples to see how this works.</w:t>
+        <w:t>Hi, I’m Kaan, and this is Caner. Today we’ll look at how we recognize brands without their names. Sometimes a color, a shape, or a package is enough. In daily life, we rarely read every logo on a shelf. Instead, we spot familiar bottles and colors. We’ll explore four famous examples to see how this works.</w:t>
       </w:r>
     </w:p>
     <w:p>
@@ -678,7 +678,7 @@
           <w:color w:val="1F2937"/>
           <w:sz w:val="22"/>
         </w:rPr>
-        <w:t>We often hear that red creates hunger and blue builds trust. But a color does not mean the same thing to everyone. With brands, we learn these links by seeing the same colors again and again. So using a color consistently matters. Can will show you some examples.</w:t>
+        <w:t>We often hear that red creates hunger and blue builds trust. But a color does not mean the same thing to everyone. With brands, we learn these links by seeing the same colors again and again. So using a color consistently matters. Caner will show you some examples.</w:t>
       </w:r>
     </w:p>
     <w:p>
@@ -703,7 +703,7 @@
           <w:color w:val="6B7280"/>
           <w:sz w:val="22"/>
         </w:rPr>
-        <w:t>Speaker: Can | Planned Timing: 36s</w:t>
+        <w:t>Speaker: Caner | Planned Timing: 36s</w:t>
       </w:r>
     </w:p>
     <w:p>
@@ -837,7 +837,7 @@
           <w:color w:val="6B7280"/>
           <w:sz w:val="22"/>
         </w:rPr>
-        <w:t>Speaker: Can | Planned Timing: 36s</w:t>
+        <w:t>Speaker: Caner | Planned Timing: 36s</w:t>
       </w:r>
     </w:p>
     <w:p>
@@ -971,7 +971,7 @@
           <w:color w:val="6B7280"/>
           <w:sz w:val="22"/>
         </w:rPr>
-        <w:t>Speaker: Can | Planned Timing: 36s</w:t>
+        <w:t>Speaker: Caner | Planned Timing: 36s</w:t>
       </w:r>
     </w:p>
     <w:p>
@@ -1105,7 +1105,7 @@
           <w:color w:val="6B7280"/>
           <w:sz w:val="22"/>
         </w:rPr>
-        <w:t>Speaker: Can | Planned Timing: 36s</w:t>
+        <w:t>Speaker: Caner | Planned Timing: 36s</w:t>
       </w:r>
     </w:p>
     <w:p>
@@ -1239,7 +1239,7 @@
           <w:color w:val="6B7280"/>
           <w:sz w:val="22"/>
         </w:rPr>
-        <w:t>Speaker: Can | Planned Timing: 36s</w:t>
+        <w:t>Speaker: Caner | Planned Timing: 36s</w:t>
       </w:r>
     </w:p>
     <w:p>
@@ -1373,7 +1373,7 @@
           <w:color w:val="6B7280"/>
           <w:sz w:val="22"/>
         </w:rPr>
-        <w:t>Speaker: Can | Planned Timing: 36s</w:t>
+        <w:t>Speaker: Caner | Planned Timing: 36s</w:t>
       </w:r>
     </w:p>
     <w:p>
@@ -1507,7 +1507,7 @@
           <w:color w:val="6B7280"/>
           <w:sz w:val="22"/>
         </w:rPr>
-        <w:t>Speaker: Can | Planned Timing: 36s</w:t>
+        <w:t>Speaker: Caner | Planned Timing: 36s</w:t>
       </w:r>
     </w:p>
     <w:p>
@@ -1641,7 +1641,7 @@
           <w:color w:val="6B7280"/>
           <w:sz w:val="22"/>
         </w:rPr>
-        <w:t>Speaker: Can | Planned Timing: 36s</w:t>
+        <w:t>Speaker: Caner | Planned Timing: 36s</w:t>
       </w:r>
     </w:p>
     <w:p>
@@ -1775,7 +1775,7 @@
           <w:color w:val="6B7280"/>
           <w:sz w:val="22"/>
         </w:rPr>
-        <w:t>Speaker: Can | Planned Timing: 36s</w:t>
+        <w:t>Speaker: Caner | Planned Timing: 36s</w:t>
       </w:r>
     </w:p>
     <w:p>
@@ -2018,7 +2018,7 @@
           <w:color w:val="1F2937"/>
           <w:sz w:val="22"/>
         </w:rPr>
-        <w:t>Thanks, Can. IKEA created another famous clue: the blue FRAKTA bag. In 1986, shoppers got tired carrying heavy goods. IKEA tested yellow bags in 1989, but checkout got confusing. So yellow bags stayed inside for borrowing. Blue bags were sold to take home. That durable bag became a familiar household clue.</w:t>
+        <w:t>Thanks, Caner. IKEA created another famous clue: the blue FRAKTA bag. In 1986, shoppers got tired carrying heavy goods. IKEA tested yellow bags in 1989, but checkout got confusing. So yellow bags stayed inside for borrowing. Blue bags were sold to take home. That durable bag became a familiar household clue.</w:t>
       </w:r>
     </w:p>
     <w:p>
@@ -2688,7 +2688,7 @@
           <w:color w:val="1F2937"/>
           <w:sz w:val="22"/>
         </w:rPr>
-        <w:t>To wrap up, logos still matter at the final moment. But in crowded places, shapes and colors catch our attention first. Bottles, fry cartons, and gift boxes guide us without words. Thank you very much for your time. Can and I are happy to take any questions.</w:t>
+        <w:t>To wrap up, logos still matter at the final moment. But in crowded places, shapes and colors catch our attention first. Bottles, fry cartons, and gift boxes guide us without words. Thank you very much for your time. Caner and I are happy to take any questions.</w:t>
       </w:r>
     </w:p>
     <w:p>

</xml_diff>